<commit_message>
Host review pages offer Guest Review Reply
</commit_message>
<xml_diff>
--- a/downloads/hosts-how-to-respond-to-a-bad-guest-review.docx
+++ b/downloads/hosts-how-to-respond-to-a-bad-guest-review.docx
@@ -714,7 +714,7 @@
           <w:color w:val="666666"/>
           <w:sz w:val="18"/>
         </w:rPr>
-        <w:t xml:space="preserve">The full version: Host Ops Pack. Six skills for the listing, review and house-rules jobs of hosts who run their own listings.</w:t>
+        <w:t xml:space="preserve">The full version: Guest Review Reply. Paste a guest review and what you know. Get a calm public reply, a private message to the guest and a note on what to fix.</w:t>
       </w:r>
     </w:p>
     <w:p>
@@ -726,7 +726,7 @@
           <w:color w:val="666666"/>
           <w:sz w:val="18"/>
         </w:rPr>
-        <w:t xml:space="preserve">$29, one price. Half price for the first 10 buyers with code FIRST10. 30-day refund.</w:t>
+        <w:t xml:space="preserve">$15, one price. Half price for the first 10 buyers with code FIRST10. 30-day refund.</w:t>
       </w:r>
     </w:p>
     <w:p>
@@ -738,7 +738,7 @@
           <w:color w:val="666666"/>
           <w:sz w:val="18"/>
         </w:rPr>
-        <w:t xml:space="preserve">More about it: https://proskillpacks.github.io/packs/host-ops-pack/</w:t>
+        <w:t xml:space="preserve">More about it: https://proskillpacks.github.io/skills/guest-review-reply/</w:t>
       </w:r>
     </w:p>
     <w:sectPr>

</xml_diff>